<commit_message>
correct docs; add module reactive
</commit_message>
<xml_diff>
--- a/docs/Terraform и WSL - Руководство по настройке и работе.docx
+++ b/docs/Terraform и WSL - Руководство по настройке и работе.docx
@@ -892,12 +892,25 @@
         <w:rPr>
           <w:rStyle w:val="VerbatimChar"/>
           <w:rFonts w:eastAsia="menlo" w:cs="menlo"/>
-          <w:color w:val="000000"/>
+          <w:b/>
+          <w:i/>
+          <w:color w:val="7030A0"/>
           <w:sz w:val="24"/>
           <w:szCs w:val="24"/>
           <w:shd w:val="clear" w:color="auto" w:fill="F8F8FA"/>
         </w:rPr>
-        <w:t>id_ed25519.pub</w:t>
+        <w:t>id_ed25519</w:t>
+      </w:r>
+      <w:r>
+        <w:rPr>
+          <w:rStyle w:val="VerbatimChar"/>
+          <w:rFonts w:eastAsia="menlo" w:cs="menlo"/>
+          <w:color w:val="000000"/>
+          <w:sz w:val="24"/>
+          <w:szCs w:val="24"/>
+          <w:shd w:val="clear" w:color="auto" w:fill="F8F8FA"/>
+        </w:rPr>
+        <w:t>.pub</w:t>
       </w:r>
       <w:r>
         <w:rPr>
@@ -917,7 +930,31 @@
           <w:szCs w:val="24"/>
           <w:shd w:val="clear" w:color="auto" w:fill="F8F8FA"/>
         </w:rPr>
-        <w:t>C:\Users\&lt;имя_пользователя&gt;\.ssh\</w:t>
+        <w:t>C:\Users\&lt;имя_пользователя&gt;\</w:t>
+      </w:r>
+      <w:r>
+        <w:rPr>
+          <w:rStyle w:val="VerbatimChar"/>
+          <w:rFonts w:eastAsia="menlo" w:cs="menlo"/>
+          <w:b/>
+          <w:i/>
+          <w:color w:val="7030A0"/>
+          <w:sz w:val="24"/>
+          <w:szCs w:val="24"/>
+          <w:shd w:val="clear" w:color="auto" w:fill="F8F8FA"/>
+        </w:rPr>
+        <w:t>.ssh</w:t>
+      </w:r>
+      <w:r>
+        <w:rPr>
+          <w:rStyle w:val="VerbatimChar"/>
+          <w:rFonts w:eastAsia="menlo" w:cs="menlo"/>
+          <w:color w:val="000000"/>
+          <w:sz w:val="24"/>
+          <w:szCs w:val="24"/>
+          <w:shd w:val="clear" w:color="auto" w:fill="F8F8FA"/>
+        </w:rPr>
+        <w:t>\</w:t>
       </w:r>
     </w:p>
     <w:p>
@@ -1194,12 +1231,31 @@
       <w:r>
         <w:rPr>
           <w:rFonts w:ascii="Consolas" w:eastAsia="source serif 4" w:hAnsi="Consolas" w:cs="source serif 4"/>
-          <w:color w:val="000000"/>
+          <w:i/>
+          <w:color w:val="7030A0"/>
           <w:sz w:val="24"/>
           <w:szCs w:val="24"/>
         </w:rPr>
         <w:lastRenderedPageBreak/>
-        <w:t xml:space="preserve">HashiCorp поддерживает APT-репозиторий, однако он </w:t>
+        <w:t>HashiCorp</w:t>
+      </w:r>
+      <w:r>
+        <w:rPr>
+          <w:rFonts w:ascii="Consolas" w:eastAsia="source serif 4" w:hAnsi="Consolas" w:cs="source serif 4"/>
+          <w:color w:val="7030A0"/>
+          <w:sz w:val="24"/>
+          <w:szCs w:val="24"/>
+        </w:rPr>
+        <w:t xml:space="preserve"> </w:t>
+      </w:r>
+      <w:r>
+        <w:rPr>
+          <w:rFonts w:ascii="Consolas" w:eastAsia="source serif 4" w:hAnsi="Consolas" w:cs="source serif 4"/>
+          <w:color w:val="000000"/>
+          <w:sz w:val="24"/>
+          <w:szCs w:val="24"/>
+        </w:rPr>
+        <w:t xml:space="preserve">поддерживает APT-репозиторий, однако он </w:t>
       </w:r>
       <w:r>
         <w:rPr>
@@ -1392,7 +1448,8 @@
         <w:rPr>
           <w:rStyle w:val="VerbatimChar"/>
           <w:rFonts w:eastAsia="menlo" w:cs="menlo"/>
-          <w:color w:val="000000"/>
+          <w:i/>
+          <w:color w:val="7030A0"/>
           <w:sz w:val="24"/>
           <w:szCs w:val="24"/>
           <w:shd w:val="clear" w:color="auto" w:fill="F8F8FA"/>
@@ -1402,11 +1459,20 @@
       <w:r>
         <w:rPr>
           <w:rFonts w:ascii="Consolas" w:eastAsia="source serif 4" w:hAnsi="Consolas" w:cs="source serif 4"/>
-          <w:color w:val="000000"/>
-          <w:sz w:val="24"/>
-          <w:szCs w:val="24"/>
-        </w:rPr>
-        <w:t xml:space="preserve"> не является одним из: </w:t>
+          <w:color w:val="7030A0"/>
+          <w:sz w:val="24"/>
+          <w:szCs w:val="24"/>
+        </w:rPr>
+        <w:t xml:space="preserve"> </w:t>
+      </w:r>
+      <w:r>
+        <w:rPr>
+          <w:rFonts w:ascii="Consolas" w:eastAsia="source serif 4" w:hAnsi="Consolas" w:cs="source serif 4"/>
+          <w:color w:val="000000"/>
+          <w:sz w:val="24"/>
+          <w:szCs w:val="24"/>
+        </w:rPr>
+        <w:t xml:space="preserve">не является одним из: </w:t>
       </w:r>
       <w:r>
         <w:rPr>
@@ -2070,16 +2136,18 @@
         <w:jc w:val="center"/>
         <w:tblCellSpacing w:w="0" w:type="dxa"/>
         <w:tblBorders>
-          <w:top w:val="single" w:sz="2" w:space="0" w:color="000000"/>
-          <w:left w:val="single" w:sz="2" w:space="0" w:color="000000"/>
-          <w:bottom w:val="single" w:sz="2" w:space="0" w:color="000000"/>
-          <w:right w:val="single" w:sz="2" w:space="0" w:color="000000"/>
+          <w:top w:val="single" w:sz="4" w:space="0" w:color="auto"/>
+          <w:left w:val="single" w:sz="4" w:space="0" w:color="auto"/>
+          <w:bottom w:val="single" w:sz="4" w:space="0" w:color="auto"/>
+          <w:right w:val="single" w:sz="4" w:space="0" w:color="auto"/>
+          <w:insideH w:val="single" w:sz="4" w:space="0" w:color="auto"/>
+          <w:insideV w:val="single" w:sz="4" w:space="0" w:color="auto"/>
         </w:tblBorders>
         <w:tblLook w:val="04A0" w:firstRow="1" w:lastRow="0" w:firstColumn="1" w:lastColumn="0" w:noHBand="0" w:noVBand="1"/>
       </w:tblPr>
       <w:tblGrid>
-        <w:gridCol w:w="6265"/>
-        <w:gridCol w:w="3097"/>
+        <w:gridCol w:w="6278"/>
+        <w:gridCol w:w="3112"/>
       </w:tblGrid>
       <w:tr>
         <w:trPr>
@@ -2090,11 +2158,6 @@
         <w:tc>
           <w:tcPr>
             <w:tcW w:w="0" w:type="auto"/>
-            <w:tcBorders>
-              <w:top w:val="single" w:sz="1" w:space="0" w:color="000000"/>
-              <w:bottom w:val="single" w:sz="1" w:space="0" w:color="000000"/>
-              <w:right w:val="single" w:sz="1" w:space="0" w:color="000000"/>
-            </w:tcBorders>
           </w:tcPr>
           <w:p>
             <w:pPr>
@@ -2119,10 +2182,6 @@
         <w:tc>
           <w:tcPr>
             <w:tcW w:w="0" w:type="auto"/>
-            <w:tcBorders>
-              <w:top w:val="single" w:sz="1" w:space="0" w:color="000000"/>
-              <w:bottom w:val="single" w:sz="1" w:space="0" w:color="000000"/>
-            </w:tcBorders>
           </w:tcPr>
           <w:p>
             <w:pPr>
@@ -2154,11 +2213,6 @@
         <w:tc>
           <w:tcPr>
             <w:tcW w:w="0" w:type="auto"/>
-            <w:tcBorders>
-              <w:top w:val="single" w:sz="1" w:space="0" w:color="000000"/>
-              <w:bottom w:val="single" w:sz="1" w:space="0" w:color="000000"/>
-              <w:right w:val="single" w:sz="1" w:space="0" w:color="000000"/>
-            </w:tcBorders>
           </w:tcPr>
           <w:p>
             <w:pPr>
@@ -2194,10 +2248,6 @@
         <w:tc>
           <w:tcPr>
             <w:tcW w:w="0" w:type="auto"/>
-            <w:tcBorders>
-              <w:top w:val="single" w:sz="1" w:space="0" w:color="000000"/>
-              <w:bottom w:val="single" w:sz="1" w:space="0" w:color="000000"/>
-            </w:tcBorders>
           </w:tcPr>
           <w:p>
             <w:pPr>
@@ -2230,11 +2280,6 @@
         <w:tc>
           <w:tcPr>
             <w:tcW w:w="0" w:type="auto"/>
-            <w:tcBorders>
-              <w:top w:val="single" w:sz="1" w:space="0" w:color="000000"/>
-              <w:bottom w:val="single" w:sz="1" w:space="0" w:color="000000"/>
-              <w:right w:val="single" w:sz="1" w:space="0" w:color="000000"/>
-            </w:tcBorders>
           </w:tcPr>
           <w:p>
             <w:pPr>
@@ -2270,10 +2315,6 @@
         <w:tc>
           <w:tcPr>
             <w:tcW w:w="0" w:type="auto"/>
-            <w:tcBorders>
-              <w:top w:val="single" w:sz="1" w:space="0" w:color="000000"/>
-              <w:bottom w:val="single" w:sz="1" w:space="0" w:color="000000"/>
-            </w:tcBorders>
           </w:tcPr>
           <w:p>
             <w:pPr>
@@ -2306,11 +2347,6 @@
         <w:tc>
           <w:tcPr>
             <w:tcW w:w="0" w:type="auto"/>
-            <w:tcBorders>
-              <w:top w:val="single" w:sz="1" w:space="0" w:color="000000"/>
-              <w:bottom w:val="single" w:sz="1" w:space="0" w:color="000000"/>
-              <w:right w:val="single" w:sz="1" w:space="0" w:color="000000"/>
-            </w:tcBorders>
           </w:tcPr>
           <w:p>
             <w:pPr>
@@ -2357,10 +2393,6 @@
         <w:tc>
           <w:tcPr>
             <w:tcW w:w="0" w:type="auto"/>
-            <w:tcBorders>
-              <w:top w:val="single" w:sz="1" w:space="0" w:color="000000"/>
-              <w:bottom w:val="single" w:sz="1" w:space="0" w:color="000000"/>
-            </w:tcBorders>
           </w:tcPr>
           <w:p>
             <w:pPr>
@@ -2392,11 +2424,6 @@
         <w:tc>
           <w:tcPr>
             <w:tcW w:w="0" w:type="auto"/>
-            <w:tcBorders>
-              <w:top w:val="single" w:sz="1" w:space="0" w:color="000000"/>
-              <w:bottom w:val="single" w:sz="1" w:space="0" w:color="000000"/>
-              <w:right w:val="single" w:sz="1" w:space="0" w:color="000000"/>
-            </w:tcBorders>
           </w:tcPr>
           <w:p>
             <w:pPr>
@@ -2421,10 +2448,6 @@
         <w:tc>
           <w:tcPr>
             <w:tcW w:w="0" w:type="auto"/>
-            <w:tcBorders>
-              <w:top w:val="single" w:sz="1" w:space="0" w:color="000000"/>
-              <w:bottom w:val="single" w:sz="1" w:space="0" w:color="000000"/>
-            </w:tcBorders>
           </w:tcPr>
           <w:p>
             <w:pPr>
@@ -2581,6 +2604,7 @@
           <w:sz w:val="24"/>
           <w:szCs w:val="24"/>
         </w:rPr>
+        <w:lastRenderedPageBreak/>
         <w:t>Проверка размера скачанного файла перед распаковкой:</w:t>
       </w:r>
     </w:p>
@@ -2602,7 +2626,6 @@
           <w:sz w:val="24"/>
           <w:szCs w:val="24"/>
         </w:rPr>
-        <w:lastRenderedPageBreak/>
         <w:t>ls -lh terraform.zip</w:t>
       </w:r>
       <w:r>
@@ -3353,16 +3376,18 @@
         <w:jc w:val="center"/>
         <w:tblCellSpacing w:w="0" w:type="dxa"/>
         <w:tblBorders>
-          <w:top w:val="single" w:sz="2" w:space="0" w:color="000000"/>
-          <w:left w:val="single" w:sz="2" w:space="0" w:color="000000"/>
-          <w:bottom w:val="single" w:sz="2" w:space="0" w:color="000000"/>
-          <w:right w:val="single" w:sz="2" w:space="0" w:color="000000"/>
+          <w:top w:val="single" w:sz="4" w:space="0" w:color="auto"/>
+          <w:left w:val="single" w:sz="4" w:space="0" w:color="auto"/>
+          <w:bottom w:val="single" w:sz="4" w:space="0" w:color="auto"/>
+          <w:right w:val="single" w:sz="4" w:space="0" w:color="auto"/>
+          <w:insideH w:val="single" w:sz="4" w:space="0" w:color="auto"/>
+          <w:insideV w:val="single" w:sz="4" w:space="0" w:color="auto"/>
         </w:tblBorders>
         <w:tblLook w:val="04A0" w:firstRow="1" w:lastRow="0" w:firstColumn="1" w:lastColumn="0" w:noHBand="0" w:noVBand="1"/>
       </w:tblPr>
       <w:tblGrid>
-        <w:gridCol w:w="3362"/>
-        <w:gridCol w:w="2173"/>
+        <w:gridCol w:w="3375"/>
+        <w:gridCol w:w="2188"/>
       </w:tblGrid>
       <w:tr>
         <w:trPr>
@@ -3373,11 +3398,6 @@
         <w:tc>
           <w:tcPr>
             <w:tcW w:w="0" w:type="auto"/>
-            <w:tcBorders>
-              <w:top w:val="single" w:sz="1" w:space="0" w:color="000000"/>
-              <w:bottom w:val="single" w:sz="1" w:space="0" w:color="000000"/>
-              <w:right w:val="single" w:sz="1" w:space="0" w:color="000000"/>
-            </w:tcBorders>
           </w:tcPr>
           <w:p>
             <w:pPr>
@@ -3402,10 +3422,6 @@
         <w:tc>
           <w:tcPr>
             <w:tcW w:w="0" w:type="auto"/>
-            <w:tcBorders>
-              <w:top w:val="single" w:sz="1" w:space="0" w:color="000000"/>
-              <w:bottom w:val="single" w:sz="1" w:space="0" w:color="000000"/>
-            </w:tcBorders>
           </w:tcPr>
           <w:p>
             <w:pPr>
@@ -3437,11 +3453,6 @@
         <w:tc>
           <w:tcPr>
             <w:tcW w:w="0" w:type="auto"/>
-            <w:tcBorders>
-              <w:top w:val="single" w:sz="1" w:space="0" w:color="000000"/>
-              <w:bottom w:val="single" w:sz="1" w:space="0" w:color="000000"/>
-              <w:right w:val="single" w:sz="1" w:space="0" w:color="000000"/>
-            </w:tcBorders>
           </w:tcPr>
           <w:p>
             <w:pPr>
@@ -3466,10 +3477,6 @@
         <w:tc>
           <w:tcPr>
             <w:tcW w:w="0" w:type="auto"/>
-            <w:tcBorders>
-              <w:top w:val="single" w:sz="1" w:space="0" w:color="000000"/>
-              <w:bottom w:val="single" w:sz="1" w:space="0" w:color="000000"/>
-            </w:tcBorders>
           </w:tcPr>
           <w:p>
             <w:pPr>
@@ -3503,11 +3510,6 @@
         <w:tc>
           <w:tcPr>
             <w:tcW w:w="0" w:type="auto"/>
-            <w:tcBorders>
-              <w:top w:val="single" w:sz="1" w:space="0" w:color="000000"/>
-              <w:bottom w:val="single" w:sz="1" w:space="0" w:color="000000"/>
-              <w:right w:val="single" w:sz="1" w:space="0" w:color="000000"/>
-            </w:tcBorders>
           </w:tcPr>
           <w:p>
             <w:pPr>
@@ -3532,10 +3534,6 @@
         <w:tc>
           <w:tcPr>
             <w:tcW w:w="0" w:type="auto"/>
-            <w:tcBorders>
-              <w:top w:val="single" w:sz="1" w:space="0" w:color="000000"/>
-              <w:bottom w:val="single" w:sz="1" w:space="0" w:color="000000"/>
-            </w:tcBorders>
           </w:tcPr>
           <w:p>
             <w:pPr>
@@ -3669,31 +3667,54 @@
         <w:rPr>
           <w:rStyle w:val="VerbatimChar"/>
           <w:rFonts w:eastAsia="menlo" w:cs="menlo"/>
-          <w:color w:val="000000"/>
+          <w:b/>
+          <w:i/>
+          <w:color w:val="7030A0"/>
           <w:sz w:val="24"/>
           <w:szCs w:val="24"/>
           <w:shd w:val="clear" w:color="auto" w:fill="F8F8FA"/>
         </w:rPr>
-        <w:t>terraform init</w:t>
-      </w:r>
-      <w:r>
-        <w:rPr>
-          <w:rFonts w:ascii="Consolas" w:eastAsia="source serif 4" w:hAnsi="Consolas" w:cs="source serif 4"/>
-          <w:color w:val="000000"/>
-          <w:sz w:val="24"/>
-          <w:szCs w:val="24"/>
-        </w:rPr>
-        <w:t xml:space="preserve"> из директории на диске Windows (</w:t>
-      </w:r>
-      <w:r>
-        <w:rPr>
-          <w:rStyle w:val="VerbatimChar"/>
-          <w:rFonts w:eastAsia="menlo" w:cs="menlo"/>
-          <w:color w:val="000000"/>
+        <w:t xml:space="preserve">terraform </w:t>
+      </w:r>
+      <w:r>
+        <w:rPr>
+          <w:rStyle w:val="VerbatimChar"/>
+          <w:rFonts w:eastAsia="menlo" w:cs="menlo"/>
+          <w:i/>
+          <w:color w:val="FF0000"/>
           <w:sz w:val="24"/>
           <w:szCs w:val="24"/>
           <w:shd w:val="clear" w:color="auto" w:fill="F8F8FA"/>
         </w:rPr>
+        <w:t>init</w:t>
+      </w:r>
+      <w:r>
+        <w:rPr>
+          <w:rFonts w:ascii="Consolas" w:eastAsia="source serif 4" w:hAnsi="Consolas" w:cs="source serif 4"/>
+          <w:color w:val="FF0000"/>
+          <w:sz w:val="24"/>
+          <w:szCs w:val="24"/>
+        </w:rPr>
+        <w:t xml:space="preserve"> </w:t>
+      </w:r>
+      <w:r>
+        <w:rPr>
+          <w:rFonts w:ascii="Consolas" w:eastAsia="source serif 4" w:hAnsi="Consolas" w:cs="source serif 4"/>
+          <w:color w:val="000000"/>
+          <w:sz w:val="24"/>
+          <w:szCs w:val="24"/>
+        </w:rPr>
+        <w:t>из директории на диске Windows (</w:t>
+      </w:r>
+      <w:r>
+        <w:rPr>
+          <w:rStyle w:val="VerbatimChar"/>
+          <w:rFonts w:eastAsia="menlo" w:cs="menlo"/>
+          <w:color w:val="000000"/>
+          <w:sz w:val="24"/>
+          <w:szCs w:val="24"/>
+          <w:shd w:val="clear" w:color="auto" w:fill="F8F8FA"/>
+        </w:rPr>
         <w:t>/mnt/d/...</w:t>
       </w:r>
       <w:r>
@@ -3704,6 +3725,181 @@
           <w:szCs w:val="24"/>
         </w:rPr>
         <w:t>) возникает ошибка:</w:t>
+      </w:r>
+      <w:bookmarkStart w:id="16" w:name="_GoBack"/>
+      <w:bookmarkEnd w:id="16"/>
+    </w:p>
+    <w:p>
+      <w:pPr>
+        <w:shd w:val="clear" w:color="auto" w:fill="F8F8FA"/>
+        <w:spacing w:after="0" w:line="336" w:lineRule="auto"/>
+        <w:rPr>
+          <w:rFonts w:ascii="Consolas" w:hAnsi="Consolas"/>
+          <w:sz w:val="24"/>
+          <w:szCs w:val="24"/>
+        </w:rPr>
+      </w:pPr>
+      <w:r>
+        <w:rPr>
+          <w:rStyle w:val="VerbatimChar"/>
+          <w:rFonts w:eastAsia="menlo" w:cs="menlo"/>
+          <w:color w:val="000000"/>
+          <w:sz w:val="20"/>
+          <w:szCs w:val="24"/>
+        </w:rPr>
+        <w:t xml:space="preserve">Error: </w:t>
+      </w:r>
+      <w:r>
+        <w:rPr>
+          <w:rStyle w:val="VerbatimChar"/>
+          <w:rFonts w:eastAsia="menlo" w:cs="menlo"/>
+          <w:color w:val="FF0000"/>
+          <w:sz w:val="20"/>
+          <w:szCs w:val="24"/>
+        </w:rPr>
+        <w:t>Failed to install provider</w:t>
+      </w:r>
+      <w:r>
+        <w:rPr>
+          <w:rStyle w:val="VerbatimChar"/>
+          <w:rFonts w:eastAsia="menlo" w:cs="menlo"/>
+          <w:color w:val="000000"/>
+          <w:sz w:val="20"/>
+          <w:szCs w:val="24"/>
+        </w:rPr>
+        <w:br/>
+        <w:t>chmod .terraform/providers/.../terraform-provider-...: operation not permitted</w:t>
+      </w:r>
+      <w:r>
+        <w:rPr>
+          <w:rStyle w:val="VerbatimChar"/>
+          <w:rFonts w:eastAsia="menlo" w:cs="menlo"/>
+          <w:color w:val="000000"/>
+          <w:sz w:val="24"/>
+          <w:szCs w:val="24"/>
+        </w:rPr>
+        <w:br/>
+      </w:r>
+    </w:p>
+    <w:p>
+      <w:pPr>
+        <w:spacing w:after="210" w:line="360" w:lineRule="auto"/>
+        <w:rPr>
+          <w:rFonts w:ascii="Consolas" w:hAnsi="Consolas"/>
+          <w:sz w:val="24"/>
+          <w:szCs w:val="24"/>
+        </w:rPr>
+      </w:pPr>
+      <w:r>
+        <w:rPr>
+          <w:rFonts w:ascii="Consolas" w:eastAsia="source serif 4" w:hAnsi="Consolas" w:cs="source serif 4"/>
+          <w:b/>
+          <w:color w:val="FF0000"/>
+          <w:sz w:val="24"/>
+          <w:szCs w:val="24"/>
+        </w:rPr>
+        <w:t>Причина</w:t>
+      </w:r>
+      <w:r>
+        <w:rPr>
+          <w:rFonts w:ascii="Consolas" w:eastAsia="source serif 4" w:hAnsi="Consolas" w:cs="source serif 4"/>
+          <w:b/>
+          <w:color w:val="000000"/>
+          <w:sz w:val="24"/>
+          <w:szCs w:val="24"/>
+        </w:rPr>
+        <w:t>:</w:t>
+      </w:r>
+      <w:r>
+        <w:rPr>
+          <w:rFonts w:ascii="Consolas" w:eastAsia="source serif 4" w:hAnsi="Consolas" w:cs="source serif 4"/>
+          <w:color w:val="000000"/>
+          <w:sz w:val="24"/>
+          <w:szCs w:val="24"/>
+        </w:rPr>
+        <w:t xml:space="preserve"> </w:t>
+      </w:r>
+      <w:r>
+        <w:rPr>
+          <w:rFonts w:ascii="Consolas" w:eastAsia="source serif 4" w:hAnsi="Consolas" w:cs="source serif 4"/>
+          <w:b/>
+          <w:color w:val="000000"/>
+          <w:sz w:val="24"/>
+          <w:szCs w:val="24"/>
+        </w:rPr>
+        <w:t>NTFS</w:t>
+      </w:r>
+      <w:r>
+        <w:rPr>
+          <w:rFonts w:ascii="Consolas" w:eastAsia="source serif 4" w:hAnsi="Consolas" w:cs="source serif 4"/>
+          <w:color w:val="000000"/>
+          <w:sz w:val="24"/>
+          <w:szCs w:val="24"/>
+        </w:rPr>
+        <w:t xml:space="preserve"> не поддерживает права доступа Linux (</w:t>
+      </w:r>
+      <w:r>
+        <w:rPr>
+          <w:rStyle w:val="VerbatimChar"/>
+          <w:rFonts w:eastAsia="menlo" w:cs="menlo"/>
+          <w:color w:val="000000"/>
+          <w:sz w:val="24"/>
+          <w:szCs w:val="24"/>
+          <w:shd w:val="clear" w:color="auto" w:fill="F8F8FA"/>
+        </w:rPr>
+        <w:t>chmod</w:t>
+      </w:r>
+      <w:r>
+        <w:rPr>
+          <w:rFonts w:ascii="Consolas" w:eastAsia="source serif 4" w:hAnsi="Consolas" w:cs="source serif 4"/>
+          <w:color w:val="000000"/>
+          <w:sz w:val="24"/>
+          <w:szCs w:val="24"/>
+        </w:rPr>
+        <w:t>) без специальной настройки монтирования.</w:t>
+      </w:r>
+    </w:p>
+    <w:p>
+      <w:pPr>
+        <w:spacing w:before="315" w:after="105" w:line="360" w:lineRule="auto"/>
+        <w:ind w:left="-30"/>
+        <w:rPr>
+          <w:rFonts w:ascii="Consolas" w:hAnsi="Consolas"/>
+          <w:sz w:val="24"/>
+          <w:szCs w:val="24"/>
+        </w:rPr>
+      </w:pPr>
+      <w:bookmarkStart w:id="17" w:name="bm_6_2_решение_настройка_wsl_conf"/>
+      <w:r>
+        <w:rPr>
+          <w:rFonts w:ascii="Consolas" w:eastAsia="source serif 4" w:hAnsi="Consolas" w:cs="source serif 4"/>
+          <w:b/>
+          <w:color w:val="000000"/>
+          <w:sz w:val="24"/>
+          <w:szCs w:val="24"/>
+        </w:rPr>
+        <w:t>6.2. Решение — настройка wsl.conf</w:t>
+      </w:r>
+      <w:bookmarkEnd w:id="17"/>
+    </w:p>
+    <w:p>
+      <w:pPr>
+        <w:spacing w:after="210" w:line="360" w:lineRule="auto"/>
+        <w:rPr>
+          <w:rFonts w:ascii="Consolas" w:hAnsi="Consolas"/>
+          <w:sz w:val="24"/>
+          <w:szCs w:val="24"/>
+        </w:rPr>
+      </w:pPr>
+      <w:r>
+        <w:rPr>
+          <w:rFonts w:ascii="Consolas" w:eastAsia="source serif 4" w:hAnsi="Consolas" w:cs="source serif 4"/>
+          <w:color w:val="000000"/>
+          <w:sz w:val="24"/>
+          <w:szCs w:val="24"/>
+        </w:rPr>
+        <w:lastRenderedPageBreak/>
+        <w:t>Добавить настройки монтирования в файл конфигурации WSL. Выполнить в Ubuntu:</w:t>
       </w:r>
     </w:p>
     <w:p>
@@ -3724,7 +3920,7 @@
           <w:sz w:val="24"/>
           <w:szCs w:val="24"/>
         </w:rPr>
-        <w:t>Error: Failed to install provider</w:t>
+        <w:t>sudo nano /etc/wsl.conf</w:t>
       </w:r>
       <w:r>
         <w:rPr>
@@ -3735,7 +3931,46 @@
           <w:szCs w:val="24"/>
         </w:rPr>
         <w:br/>
-        <w:t>chmod .terraform/providers/.../terraform-provider-...: operation not permitted</w:t>
+      </w:r>
+    </w:p>
+    <w:p>
+      <w:pPr>
+        <w:spacing w:after="210" w:line="360" w:lineRule="auto"/>
+        <w:rPr>
+          <w:rFonts w:ascii="Consolas" w:hAnsi="Consolas"/>
+          <w:sz w:val="24"/>
+          <w:szCs w:val="24"/>
+        </w:rPr>
+      </w:pPr>
+      <w:r>
+        <w:rPr>
+          <w:rFonts w:ascii="Consolas" w:eastAsia="source serif 4" w:hAnsi="Consolas" w:cs="source serif 4"/>
+          <w:color w:val="000000"/>
+          <w:sz w:val="24"/>
+          <w:szCs w:val="24"/>
+        </w:rPr>
+        <w:t>Вставить следующее содержимое:</w:t>
+      </w:r>
+    </w:p>
+    <w:p>
+      <w:pPr>
+        <w:shd w:val="clear" w:color="auto" w:fill="F8F8FA"/>
+        <w:spacing w:line="336" w:lineRule="auto"/>
+        <w:rPr>
+          <w:rFonts w:ascii="Consolas" w:hAnsi="Consolas"/>
+          <w:sz w:val="24"/>
+          <w:szCs w:val="24"/>
+        </w:rPr>
+      </w:pPr>
+      <w:r>
+        <w:rPr>
+          <w:rStyle w:val="VerbatimChar"/>
+          <w:rFonts w:eastAsia="menlo" w:cs="menlo"/>
+          <w:color w:val="000000"/>
+          <w:sz w:val="24"/>
+          <w:szCs w:val="24"/>
+        </w:rPr>
+        <w:t>[automount]</w:t>
       </w:r>
       <w:r>
         <w:rPr>
@@ -3746,6 +3981,17 @@
           <w:szCs w:val="24"/>
         </w:rPr>
         <w:br/>
+        <w:t>options = "metadata,umask=22,fmask=11"</w:t>
+      </w:r>
+      <w:r>
+        <w:rPr>
+          <w:rStyle w:val="VerbatimChar"/>
+          <w:rFonts w:eastAsia="menlo" w:cs="menlo"/>
+          <w:color w:val="000000"/>
+          <w:sz w:val="24"/>
+          <w:szCs w:val="24"/>
+        </w:rPr>
+        <w:br/>
       </w:r>
     </w:p>
     <w:p>
@@ -3760,31 +4006,139 @@
       <w:r>
         <w:rPr>
           <w:rFonts w:ascii="Consolas" w:eastAsia="source serif 4" w:hAnsi="Consolas" w:cs="source serif 4"/>
-          <w:b/>
-          <w:color w:val="FF0000"/>
-          <w:sz w:val="24"/>
-          <w:szCs w:val="24"/>
-        </w:rPr>
-        <w:t>Причина</w:t>
-      </w:r>
-      <w:r>
-        <w:rPr>
-          <w:rFonts w:ascii="Consolas" w:eastAsia="source serif 4" w:hAnsi="Consolas" w:cs="source serif 4"/>
-          <w:b/>
-          <w:color w:val="000000"/>
-          <w:sz w:val="24"/>
-          <w:szCs w:val="24"/>
-        </w:rPr>
-        <w:t>:</w:t>
-      </w:r>
-      <w:r>
-        <w:rPr>
-          <w:rFonts w:ascii="Consolas" w:eastAsia="source serif 4" w:hAnsi="Consolas" w:cs="source serif 4"/>
-          <w:color w:val="000000"/>
-          <w:sz w:val="24"/>
-          <w:szCs w:val="24"/>
-        </w:rPr>
-        <w:t xml:space="preserve"> NTFS не поддерживает права доступа Linux (</w:t>
+          <w:color w:val="000000"/>
+          <w:sz w:val="24"/>
+          <w:szCs w:val="24"/>
+        </w:rPr>
+        <w:t xml:space="preserve">Сохранить: </w:t>
+      </w:r>
+      <w:r>
+        <w:rPr>
+          <w:rFonts w:ascii="Consolas" w:eastAsia="source serif 4" w:hAnsi="Consolas" w:cs="source serif 4"/>
+          <w:b/>
+          <w:color w:val="000000"/>
+          <w:sz w:val="24"/>
+          <w:szCs w:val="24"/>
+        </w:rPr>
+        <w:t>Ctrl+O</w:t>
+      </w:r>
+      <w:r>
+        <w:rPr>
+          <w:rFonts w:ascii="Consolas" w:eastAsia="source serif 4" w:hAnsi="Consolas" w:cs="source serif 4"/>
+          <w:color w:val="000000"/>
+          <w:sz w:val="24"/>
+          <w:szCs w:val="24"/>
+        </w:rPr>
+        <w:t xml:space="preserve"> → </w:t>
+      </w:r>
+      <w:r>
+        <w:rPr>
+          <w:rFonts w:ascii="Consolas" w:eastAsia="source serif 4" w:hAnsi="Consolas" w:cs="source serif 4"/>
+          <w:b/>
+          <w:color w:val="000000"/>
+          <w:sz w:val="24"/>
+          <w:szCs w:val="24"/>
+        </w:rPr>
+        <w:t>Enter</w:t>
+      </w:r>
+      <w:r>
+        <w:rPr>
+          <w:rFonts w:ascii="Consolas" w:eastAsia="source serif 4" w:hAnsi="Consolas" w:cs="source serif 4"/>
+          <w:color w:val="000000"/>
+          <w:sz w:val="24"/>
+          <w:szCs w:val="24"/>
+        </w:rPr>
+        <w:t xml:space="preserve"> → </w:t>
+      </w:r>
+      <w:r>
+        <w:rPr>
+          <w:rFonts w:ascii="Consolas" w:eastAsia="source serif 4" w:hAnsi="Consolas" w:cs="source serif 4"/>
+          <w:b/>
+          <w:color w:val="000000"/>
+          <w:sz w:val="24"/>
+          <w:szCs w:val="24"/>
+        </w:rPr>
+        <w:t>Ctrl+X</w:t>
+      </w:r>
+    </w:p>
+    <w:p>
+      <w:pPr>
+        <w:spacing w:after="210" w:line="360" w:lineRule="auto"/>
+        <w:rPr>
+          <w:rFonts w:ascii="Consolas" w:hAnsi="Consolas"/>
+          <w:sz w:val="24"/>
+          <w:szCs w:val="24"/>
+        </w:rPr>
+      </w:pPr>
+      <w:r>
+        <w:rPr>
+          <w:rFonts w:ascii="Consolas" w:eastAsia="source serif 4" w:hAnsi="Consolas" w:cs="source serif 4"/>
+          <w:color w:val="000000"/>
+          <w:sz w:val="24"/>
+          <w:szCs w:val="24"/>
+        </w:rPr>
+        <w:t>Перезапустить WSL из CMD:</w:t>
+      </w:r>
+    </w:p>
+    <w:p>
+      <w:pPr>
+        <w:shd w:val="clear" w:color="auto" w:fill="F8F8FA"/>
+        <w:spacing w:line="336" w:lineRule="auto"/>
+        <w:rPr>
+          <w:rFonts w:ascii="Consolas" w:hAnsi="Consolas"/>
+          <w:sz w:val="24"/>
+          <w:szCs w:val="24"/>
+        </w:rPr>
+      </w:pPr>
+      <w:r>
+        <w:rPr>
+          <w:rStyle w:val="VerbatimChar"/>
+          <w:rFonts w:eastAsia="menlo" w:cs="menlo"/>
+          <w:color w:val="000000"/>
+          <w:sz w:val="24"/>
+          <w:szCs w:val="24"/>
+        </w:rPr>
+        <w:t>wsl --shutdown</w:t>
+      </w:r>
+      <w:r>
+        <w:rPr>
+          <w:rStyle w:val="VerbatimChar"/>
+          <w:rFonts w:eastAsia="menlo" w:cs="menlo"/>
+          <w:color w:val="000000"/>
+          <w:sz w:val="24"/>
+          <w:szCs w:val="24"/>
+        </w:rPr>
+        <w:br/>
+        <w:t>wsl -d Ubuntu</w:t>
+      </w:r>
+      <w:r>
+        <w:rPr>
+          <w:rStyle w:val="VerbatimChar"/>
+          <w:rFonts w:eastAsia="menlo" w:cs="menlo"/>
+          <w:color w:val="000000"/>
+          <w:sz w:val="24"/>
+          <w:szCs w:val="24"/>
+        </w:rPr>
+        <w:br/>
+      </w:r>
+    </w:p>
+    <w:p>
+      <w:pPr>
+        <w:spacing w:after="210" w:line="360" w:lineRule="auto"/>
+        <w:rPr>
+          <w:rFonts w:ascii="Consolas" w:hAnsi="Consolas"/>
+          <w:sz w:val="24"/>
+          <w:szCs w:val="24"/>
+        </w:rPr>
+      </w:pPr>
+      <w:r>
+        <w:rPr>
+          <w:rFonts w:ascii="Consolas" w:eastAsia="source serif 4" w:hAnsi="Consolas" w:cs="source serif 4"/>
+          <w:color w:val="000000"/>
+          <w:sz w:val="24"/>
+          <w:szCs w:val="24"/>
+        </w:rPr>
+        <w:t xml:space="preserve">После перезапуска диски Windows монтируются с поддержкой метаданных прав — </w:t>
       </w:r>
       <w:r>
         <w:rPr>
@@ -3804,7 +4158,7 @@
           <w:sz w:val="24"/>
           <w:szCs w:val="24"/>
         </w:rPr>
-        <w:t>) без специальной настройки монтирования.</w:t>
+        <w:t xml:space="preserve"> работает корректно.</w:t>
       </w:r>
     </w:p>
     <w:p>
@@ -3817,309 +4171,7 @@
           <w:szCs w:val="24"/>
         </w:rPr>
       </w:pPr>
-      <w:bookmarkStart w:id="16" w:name="bm_6_2_решение_настройка_wsl_conf"/>
-      <w:r>
-        <w:rPr>
-          <w:rFonts w:ascii="Consolas" w:eastAsia="source serif 4" w:hAnsi="Consolas" w:cs="source serif 4"/>
-          <w:b/>
-          <w:color w:val="000000"/>
-          <w:sz w:val="24"/>
-          <w:szCs w:val="24"/>
-        </w:rPr>
-        <w:lastRenderedPageBreak/>
-        <w:t>6.2. Решение — настройка wsl.conf</w:t>
-      </w:r>
-      <w:bookmarkEnd w:id="16"/>
-    </w:p>
-    <w:p>
-      <w:pPr>
-        <w:spacing w:after="210" w:line="360" w:lineRule="auto"/>
-        <w:rPr>
-          <w:rFonts w:ascii="Consolas" w:hAnsi="Consolas"/>
-          <w:sz w:val="24"/>
-          <w:szCs w:val="24"/>
-        </w:rPr>
-      </w:pPr>
-      <w:r>
-        <w:rPr>
-          <w:rFonts w:ascii="Consolas" w:eastAsia="source serif 4" w:hAnsi="Consolas" w:cs="source serif 4"/>
-          <w:color w:val="000000"/>
-          <w:sz w:val="24"/>
-          <w:szCs w:val="24"/>
-        </w:rPr>
-        <w:t>Добавить настройки монтирования в файл конфигурации WSL. Выполнить в Ubuntu:</w:t>
-      </w:r>
-    </w:p>
-    <w:p>
-      <w:pPr>
-        <w:shd w:val="clear" w:color="auto" w:fill="F8F8FA"/>
-        <w:spacing w:line="336" w:lineRule="auto"/>
-        <w:rPr>
-          <w:rFonts w:ascii="Consolas" w:hAnsi="Consolas"/>
-          <w:sz w:val="24"/>
-          <w:szCs w:val="24"/>
-        </w:rPr>
-      </w:pPr>
-      <w:r>
-        <w:rPr>
-          <w:rStyle w:val="VerbatimChar"/>
-          <w:rFonts w:eastAsia="menlo" w:cs="menlo"/>
-          <w:color w:val="000000"/>
-          <w:sz w:val="24"/>
-          <w:szCs w:val="24"/>
-        </w:rPr>
-        <w:t>sudo nano /etc/wsl.conf</w:t>
-      </w:r>
-      <w:r>
-        <w:rPr>
-          <w:rStyle w:val="VerbatimChar"/>
-          <w:rFonts w:eastAsia="menlo" w:cs="menlo"/>
-          <w:color w:val="000000"/>
-          <w:sz w:val="24"/>
-          <w:szCs w:val="24"/>
-        </w:rPr>
-        <w:br/>
-      </w:r>
-    </w:p>
-    <w:p>
-      <w:pPr>
-        <w:spacing w:after="210" w:line="360" w:lineRule="auto"/>
-        <w:rPr>
-          <w:rFonts w:ascii="Consolas" w:hAnsi="Consolas"/>
-          <w:sz w:val="24"/>
-          <w:szCs w:val="24"/>
-        </w:rPr>
-      </w:pPr>
-      <w:r>
-        <w:rPr>
-          <w:rFonts w:ascii="Consolas" w:eastAsia="source serif 4" w:hAnsi="Consolas" w:cs="source serif 4"/>
-          <w:color w:val="000000"/>
-          <w:sz w:val="24"/>
-          <w:szCs w:val="24"/>
-        </w:rPr>
-        <w:t>Вставить следующее содержимое:</w:t>
-      </w:r>
-    </w:p>
-    <w:p>
-      <w:pPr>
-        <w:shd w:val="clear" w:color="auto" w:fill="F8F8FA"/>
-        <w:spacing w:line="336" w:lineRule="auto"/>
-        <w:rPr>
-          <w:rFonts w:ascii="Consolas" w:hAnsi="Consolas"/>
-          <w:sz w:val="24"/>
-          <w:szCs w:val="24"/>
-        </w:rPr>
-      </w:pPr>
-      <w:r>
-        <w:rPr>
-          <w:rStyle w:val="VerbatimChar"/>
-          <w:rFonts w:eastAsia="menlo" w:cs="menlo"/>
-          <w:color w:val="000000"/>
-          <w:sz w:val="24"/>
-          <w:szCs w:val="24"/>
-        </w:rPr>
-        <w:t>[automount]</w:t>
-      </w:r>
-      <w:r>
-        <w:rPr>
-          <w:rStyle w:val="VerbatimChar"/>
-          <w:rFonts w:eastAsia="menlo" w:cs="menlo"/>
-          <w:color w:val="000000"/>
-          <w:sz w:val="24"/>
-          <w:szCs w:val="24"/>
-        </w:rPr>
-        <w:br/>
-        <w:t>options = "metadata,umask=22,fmask=11"</w:t>
-      </w:r>
-      <w:r>
-        <w:rPr>
-          <w:rStyle w:val="VerbatimChar"/>
-          <w:rFonts w:eastAsia="menlo" w:cs="menlo"/>
-          <w:color w:val="000000"/>
-          <w:sz w:val="24"/>
-          <w:szCs w:val="24"/>
-        </w:rPr>
-        <w:br/>
-      </w:r>
-    </w:p>
-    <w:p>
-      <w:pPr>
-        <w:spacing w:after="210" w:line="360" w:lineRule="auto"/>
-        <w:rPr>
-          <w:rFonts w:ascii="Consolas" w:hAnsi="Consolas"/>
-          <w:sz w:val="24"/>
-          <w:szCs w:val="24"/>
-        </w:rPr>
-      </w:pPr>
-      <w:r>
-        <w:rPr>
-          <w:rFonts w:ascii="Consolas" w:eastAsia="source serif 4" w:hAnsi="Consolas" w:cs="source serif 4"/>
-          <w:color w:val="000000"/>
-          <w:sz w:val="24"/>
-          <w:szCs w:val="24"/>
-        </w:rPr>
-        <w:t xml:space="preserve">Сохранить: </w:t>
-      </w:r>
-      <w:r>
-        <w:rPr>
-          <w:rFonts w:ascii="Consolas" w:eastAsia="source serif 4" w:hAnsi="Consolas" w:cs="source serif 4"/>
-          <w:b/>
-          <w:color w:val="000000"/>
-          <w:sz w:val="24"/>
-          <w:szCs w:val="24"/>
-        </w:rPr>
-        <w:t>Ctrl+O</w:t>
-      </w:r>
-      <w:r>
-        <w:rPr>
-          <w:rFonts w:ascii="Consolas" w:eastAsia="source serif 4" w:hAnsi="Consolas" w:cs="source serif 4"/>
-          <w:color w:val="000000"/>
-          <w:sz w:val="24"/>
-          <w:szCs w:val="24"/>
-        </w:rPr>
-        <w:t xml:space="preserve"> → </w:t>
-      </w:r>
-      <w:r>
-        <w:rPr>
-          <w:rFonts w:ascii="Consolas" w:eastAsia="source serif 4" w:hAnsi="Consolas" w:cs="source serif 4"/>
-          <w:b/>
-          <w:color w:val="000000"/>
-          <w:sz w:val="24"/>
-          <w:szCs w:val="24"/>
-        </w:rPr>
-        <w:t>Enter</w:t>
-      </w:r>
-      <w:r>
-        <w:rPr>
-          <w:rFonts w:ascii="Consolas" w:eastAsia="source serif 4" w:hAnsi="Consolas" w:cs="source serif 4"/>
-          <w:color w:val="000000"/>
-          <w:sz w:val="24"/>
-          <w:szCs w:val="24"/>
-        </w:rPr>
-        <w:t xml:space="preserve"> → </w:t>
-      </w:r>
-      <w:r>
-        <w:rPr>
-          <w:rFonts w:ascii="Consolas" w:eastAsia="source serif 4" w:hAnsi="Consolas" w:cs="source serif 4"/>
-          <w:b/>
-          <w:color w:val="000000"/>
-          <w:sz w:val="24"/>
-          <w:szCs w:val="24"/>
-        </w:rPr>
-        <w:t>Ctrl+X</w:t>
-      </w:r>
-    </w:p>
-    <w:p>
-      <w:pPr>
-        <w:spacing w:after="210" w:line="360" w:lineRule="auto"/>
-        <w:rPr>
-          <w:rFonts w:ascii="Consolas" w:hAnsi="Consolas"/>
-          <w:sz w:val="24"/>
-          <w:szCs w:val="24"/>
-        </w:rPr>
-      </w:pPr>
-      <w:r>
-        <w:rPr>
-          <w:rFonts w:ascii="Consolas" w:eastAsia="source serif 4" w:hAnsi="Consolas" w:cs="source serif 4"/>
-          <w:color w:val="000000"/>
-          <w:sz w:val="24"/>
-          <w:szCs w:val="24"/>
-        </w:rPr>
-        <w:t>Перезапустить WSL из CMD:</w:t>
-      </w:r>
-    </w:p>
-    <w:p>
-      <w:pPr>
-        <w:shd w:val="clear" w:color="auto" w:fill="F8F8FA"/>
-        <w:spacing w:line="336" w:lineRule="auto"/>
-        <w:rPr>
-          <w:rFonts w:ascii="Consolas" w:hAnsi="Consolas"/>
-          <w:sz w:val="24"/>
-          <w:szCs w:val="24"/>
-        </w:rPr>
-      </w:pPr>
-      <w:r>
-        <w:rPr>
-          <w:rStyle w:val="VerbatimChar"/>
-          <w:rFonts w:eastAsia="menlo" w:cs="menlo"/>
-          <w:color w:val="000000"/>
-          <w:sz w:val="24"/>
-          <w:szCs w:val="24"/>
-        </w:rPr>
-        <w:t>wsl --shutdown</w:t>
-      </w:r>
-      <w:r>
-        <w:rPr>
-          <w:rStyle w:val="VerbatimChar"/>
-          <w:rFonts w:eastAsia="menlo" w:cs="menlo"/>
-          <w:color w:val="000000"/>
-          <w:sz w:val="24"/>
-          <w:szCs w:val="24"/>
-        </w:rPr>
-        <w:br/>
-        <w:t>wsl -d Ubuntu</w:t>
-      </w:r>
-      <w:r>
-        <w:rPr>
-          <w:rStyle w:val="VerbatimChar"/>
-          <w:rFonts w:eastAsia="menlo" w:cs="menlo"/>
-          <w:color w:val="000000"/>
-          <w:sz w:val="24"/>
-          <w:szCs w:val="24"/>
-        </w:rPr>
-        <w:br/>
-      </w:r>
-    </w:p>
-    <w:p>
-      <w:pPr>
-        <w:spacing w:after="210" w:line="360" w:lineRule="auto"/>
-        <w:rPr>
-          <w:rFonts w:ascii="Consolas" w:hAnsi="Consolas"/>
-          <w:sz w:val="24"/>
-          <w:szCs w:val="24"/>
-        </w:rPr>
-      </w:pPr>
-      <w:r>
-        <w:rPr>
-          <w:rFonts w:ascii="Consolas" w:eastAsia="source serif 4" w:hAnsi="Consolas" w:cs="source serif 4"/>
-          <w:color w:val="000000"/>
-          <w:sz w:val="24"/>
-          <w:szCs w:val="24"/>
-        </w:rPr>
-        <w:t xml:space="preserve">После перезапуска диски Windows монтируются с поддержкой метаданных прав — </w:t>
-      </w:r>
-      <w:r>
-        <w:rPr>
-          <w:rStyle w:val="VerbatimChar"/>
-          <w:rFonts w:eastAsia="menlo" w:cs="menlo"/>
-          <w:color w:val="000000"/>
-          <w:sz w:val="24"/>
-          <w:szCs w:val="24"/>
-          <w:shd w:val="clear" w:color="auto" w:fill="F8F8FA"/>
-        </w:rPr>
-        <w:t>chmod</w:t>
-      </w:r>
-      <w:r>
-        <w:rPr>
-          <w:rFonts w:ascii="Consolas" w:eastAsia="source serif 4" w:hAnsi="Consolas" w:cs="source serif 4"/>
-          <w:color w:val="000000"/>
-          <w:sz w:val="24"/>
-          <w:szCs w:val="24"/>
-        </w:rPr>
-        <w:t xml:space="preserve"> работает корректно.</w:t>
-      </w:r>
-    </w:p>
-    <w:p>
-      <w:pPr>
-        <w:spacing w:before="315" w:after="105" w:line="360" w:lineRule="auto"/>
-        <w:ind w:left="-30"/>
-        <w:rPr>
-          <w:rFonts w:ascii="Consolas" w:hAnsi="Consolas"/>
-          <w:sz w:val="24"/>
-          <w:szCs w:val="24"/>
-        </w:rPr>
-      </w:pPr>
-      <w:bookmarkStart w:id="17" w:name="bm_6_3_ручное_монтирование_если_д_f16c52"/>
+      <w:bookmarkStart w:id="18" w:name="bm_6_3_ручное_монтирование_если_д_f16c52"/>
       <w:r>
         <w:rPr>
           <w:rFonts w:ascii="Consolas" w:eastAsia="source serif 4" w:hAnsi="Consolas" w:cs="source serif 4"/>
@@ -4130,7 +4182,7 @@
         </w:rPr>
         <w:t>6.3. Ручное монтирование (если диск не смонтирован)</w:t>
       </w:r>
-      <w:bookmarkEnd w:id="17"/>
+      <w:bookmarkEnd w:id="18"/>
     </w:p>
     <w:p>
       <w:pPr>
@@ -4254,7 +4306,7 @@
           <w:szCs w:val="24"/>
         </w:rPr>
       </w:pPr>
-      <w:bookmarkStart w:id="18" w:name="bm_7_типичные_ошибки_и_решения"/>
+      <w:bookmarkStart w:id="19" w:name="bm_7_типичные_ошибки_и_решения"/>
       <w:r>
         <w:rPr>
           <w:rFonts w:ascii="Consolas" w:eastAsia="source serif 4" w:hAnsi="Consolas" w:cs="source serif 4"/>
@@ -4265,7 +4317,7 @@
         </w:rPr>
         <w:t>7. Типичные ошибки и решения</w:t>
       </w:r>
-      <w:bookmarkEnd w:id="18"/>
+      <w:bookmarkEnd w:id="19"/>
     </w:p>
     <w:p>
       <w:pPr>
@@ -4277,7 +4329,7 @@
           <w:szCs w:val="24"/>
         </w:rPr>
       </w:pPr>
-      <w:bookmarkStart w:id="19" w:name="bm_7_1_curl_скачивает_маленький_ф_81f0de"/>
+      <w:bookmarkStart w:id="20" w:name="bm_7_1_curl_скачивает_маленький_ф_81f0de"/>
       <w:r>
         <w:rPr>
           <w:rFonts w:ascii="Consolas" w:eastAsia="source serif 4" w:hAnsi="Consolas" w:cs="source serif 4"/>
@@ -4307,7 +4359,7 @@
         </w:rPr>
         <w:t xml:space="preserve"> (3–5 КБ)</w:t>
       </w:r>
-      <w:bookmarkEnd w:id="19"/>
+      <w:bookmarkEnd w:id="20"/>
     </w:p>
     <w:p>
       <w:pPr>
@@ -4522,7 +4574,7 @@
           <w:szCs w:val="24"/>
         </w:rPr>
       </w:pPr>
-      <w:bookmarkStart w:id="20" w:name="bm_7_2_unzip_не_является_zip_архивом"/>
+      <w:bookmarkStart w:id="21" w:name="bm_7_2_unzip_не_является_zip_архивом"/>
       <w:r>
         <w:rPr>
           <w:rFonts w:ascii="Consolas" w:eastAsia="source serif 4" w:hAnsi="Consolas" w:cs="source serif 4"/>
@@ -4533,7 +4585,7 @@
         </w:rPr>
         <w:t>7.2. unzip: не является zip-архивом</w:t>
       </w:r>
-      <w:bookmarkEnd w:id="20"/>
+      <w:bookmarkEnd w:id="21"/>
     </w:p>
     <w:p>
       <w:pPr>
@@ -4747,7 +4799,7 @@
           <w:szCs w:val="24"/>
         </w:rPr>
       </w:pPr>
-      <w:bookmarkStart w:id="21" w:name="bm_7_3_chmod_operation_not_permitted"/>
+      <w:bookmarkStart w:id="22" w:name="bm_7_3_chmod_operation_not_permitted"/>
       <w:r>
         <w:rPr>
           <w:rFonts w:ascii="Consolas" w:eastAsia="source serif 4" w:hAnsi="Consolas" w:cs="source serif 4"/>
@@ -4758,7 +4810,7 @@
         </w:rPr>
         <w:t>7.3. chmod: operation not permitted</w:t>
       </w:r>
-      <w:bookmarkEnd w:id="21"/>
+      <w:bookmarkEnd w:id="22"/>
     </w:p>
     <w:p>
       <w:pPr>
@@ -4981,7 +5033,7 @@
           <w:szCs w:val="24"/>
         </w:rPr>
       </w:pPr>
-      <w:bookmarkStart w:id="22" w:name="bm_7_4_gpg_no_valid_openpgp_data_found"/>
+      <w:bookmarkStart w:id="23" w:name="bm_7_4_gpg_no_valid_openpgp_data_found"/>
       <w:r>
         <w:rPr>
           <w:rFonts w:ascii="Consolas" w:eastAsia="source serif 4" w:hAnsi="Consolas" w:cs="source serif 4"/>
@@ -4992,7 +5044,7 @@
         </w:rPr>
         <w:t>7.4. GPG: no valid OpenPGP data found</w:t>
       </w:r>
-      <w:bookmarkEnd w:id="22"/>
+      <w:bookmarkEnd w:id="23"/>
     </w:p>
     <w:p>
       <w:pPr>
@@ -5194,7 +5246,7 @@
           <w:szCs w:val="24"/>
         </w:rPr>
       </w:pPr>
-      <w:bookmarkStart w:id="23" w:name="bm_7_5_apt_репозиторий_hashicorp_c19f7e"/>
+      <w:bookmarkStart w:id="24" w:name="bm_7_5_apt_репозиторий_hashicorp_c19f7e"/>
       <w:r>
         <w:rPr>
           <w:rFonts w:ascii="Consolas" w:eastAsia="source serif 4" w:hAnsi="Consolas" w:cs="source serif 4"/>
@@ -5205,7 +5257,7 @@
         </w:rPr>
         <w:t>7.5. APT репозиторий HashiCorp — 404 Not Found</w:t>
       </w:r>
-      <w:bookmarkEnd w:id="23"/>
+      <w:bookmarkEnd w:id="24"/>
     </w:p>
     <w:p>
       <w:pPr>
@@ -5378,7 +5430,7 @@
           <w:szCs w:val="24"/>
         </w:rPr>
       </w:pPr>
-      <w:bookmarkStart w:id="24" w:name="bm_7_6_wsl_command_not_found_внутри_wsl"/>
+      <w:bookmarkStart w:id="25" w:name="bm_7_6_wsl_command_not_found_внутри_wsl"/>
       <w:r>
         <w:rPr>
           <w:rFonts w:ascii="Consolas" w:eastAsia="source serif 4" w:hAnsi="Consolas" w:cs="source serif 4"/>
@@ -5389,7 +5441,7 @@
         </w:rPr>
         <w:t>7.6. wsl: command not found (внутри WSL)</w:t>
       </w:r>
-      <w:bookmarkEnd w:id="24"/>
+      <w:bookmarkEnd w:id="25"/>
     </w:p>
     <w:p>
       <w:pPr>
@@ -5601,7 +5653,7 @@
           <w:szCs w:val="24"/>
         </w:rPr>
       </w:pPr>
-      <w:bookmarkStart w:id="25" w:name="bm_7_7_url_с_markdown_форматирова_9e3818"/>
+      <w:bookmarkStart w:id="26" w:name="bm_7_7_url_с_markdown_форматирова_9e3818"/>
       <w:r>
         <w:rPr>
           <w:rFonts w:ascii="Consolas" w:eastAsia="source serif 4" w:hAnsi="Consolas" w:cs="source serif 4"/>
@@ -5612,7 +5664,7 @@
         </w:rPr>
         <w:t>7.7. URL с markdown-форматированием при копировании</w:t>
       </w:r>
-      <w:bookmarkEnd w:id="25"/>
+      <w:bookmarkEnd w:id="26"/>
     </w:p>
     <w:p>
       <w:pPr>
@@ -5897,7 +5949,7 @@
           <w:szCs w:val="24"/>
         </w:rPr>
       </w:pPr>
-      <w:bookmarkStart w:id="26" w:name="bm_8_рабочий_процесс_terraform"/>
+      <w:bookmarkStart w:id="27" w:name="bm_8_рабочий_процесс_terraform"/>
       <w:r>
         <w:rPr>
           <w:rFonts w:ascii="Consolas" w:eastAsia="source serif 4" w:hAnsi="Consolas" w:cs="source serif 4"/>
@@ -5908,7 +5960,7 @@
         </w:rPr>
         <w:t>8. Рабочий процесс Terraform</w:t>
       </w:r>
-      <w:bookmarkEnd w:id="26"/>
+      <w:bookmarkEnd w:id="27"/>
     </w:p>
     <w:p>
       <w:pPr>
@@ -5939,7 +5991,7 @@
           <w:szCs w:val="24"/>
         </w:rPr>
       </w:pPr>
-      <w:bookmarkStart w:id="27" w:name="bm_8_1_войти_в_wsl_ubuntu"/>
+      <w:bookmarkStart w:id="28" w:name="bm_8_1_войти_в_wsl_ubuntu"/>
       <w:r>
         <w:rPr>
           <w:rFonts w:ascii="Consolas" w:eastAsia="source serif 4" w:hAnsi="Consolas" w:cs="source serif 4"/>
@@ -5950,7 +6002,7 @@
         </w:rPr>
         <w:t>8.1. Войти в WSL Ubuntu</w:t>
       </w:r>
-      <w:bookmarkEnd w:id="27"/>
+      <w:bookmarkEnd w:id="28"/>
     </w:p>
     <w:p>
       <w:pPr>
@@ -5993,7 +6045,7 @@
           <w:szCs w:val="24"/>
         </w:rPr>
       </w:pPr>
-      <w:bookmarkStart w:id="28" w:name="bm_8_2_перейти_в_директорию_проекта"/>
+      <w:bookmarkStart w:id="29" w:name="bm_8_2_перейти_в_директорию_проекта"/>
       <w:r>
         <w:rPr>
           <w:rFonts w:ascii="Consolas" w:eastAsia="source serif 4" w:hAnsi="Consolas" w:cs="source serif 4"/>
@@ -6004,7 +6056,7 @@
         </w:rPr>
         <w:t>8.2. Перейти в директорию проекта</w:t>
       </w:r>
-      <w:bookmarkEnd w:id="28"/>
+      <w:bookmarkEnd w:id="29"/>
     </w:p>
     <w:p>
       <w:pPr>
@@ -6181,8 +6233,6 @@
           <w:lang w:val="en-US"/>
         </w:rPr>
       </w:pPr>
-      <w:bookmarkStart w:id="29" w:name="_GoBack"/>
-      <w:bookmarkEnd w:id="29"/>
     </w:p>
     <w:p>
       <w:pPr>

</xml_diff>